<commit_message>
added name and assignment to word doc
</commit_message>
<xml_diff>
--- a/module-3/Gordon_module3_2.docx
+++ b/module-3/Gordon_module3_2.docx
@@ -3,7 +3,141 @@
 <w:document xmlns:wpc="http://schemas.microsoft.com/office/word/2010/wordprocessingCanvas" xmlns:cx="http://schemas.microsoft.com/office/drawing/2014/chartex" xmlns:cx1="http://schemas.microsoft.com/office/drawing/2015/9/8/chartex" xmlns:cx2="http://schemas.microsoft.com/office/drawing/2015/10/21/chartex" xmlns:cx3="http://schemas.microsoft.com/office/drawing/2016/5/9/chartex" xmlns:cx4="http://schemas.microsoft.com/office/drawing/2016/5/10/chartex" xmlns:cx5="http://schemas.microsoft.com/office/drawing/2016/5/11/chartex" xmlns:cx6="http://schemas.microsoft.com/office/drawing/2016/5/12/chartex" xmlns:cx7="http://schemas.microsoft.com/office/drawing/2016/5/13/chartex" xmlns:cx8="http://schemas.microsoft.com/office/drawing/2016/5/14/chartex" xmlns:mc="http://schemas.openxmlformats.org/markup-compatibility/2006" xmlns:aink="http://schemas.microsoft.com/office/drawing/2016/ink" xmlns:am3d="http://schemas.microsoft.com/office/drawing/2017/model3d" xmlns:o="urn:schemas-microsoft-com:office:office" xmlns:oel="http://schemas.microsoft.com/office/2019/extlst" xmlns:r="http://schemas.openxmlformats.org/officeDocument/2006/relationships" xmlns:m="http://schemas.openxmlformats.org/officeDocument/2006/math" xmlns:v="urn:schemas-microsoft-com:vml" xmlns:wp14="http://schemas.microsoft.com/office/word/2010/wordprocessingDrawing" xmlns:wp="http://schemas.openxmlformats.org/drawingml/2006/wordprocessingDrawing" xmlns:w10="urn:schemas-microsoft-com:office:word" xmlns:w="http://schemas.openxmlformats.org/wordprocessingml/2006/main" xmlns:w14="http://schemas.microsoft.com/office/word/2010/wordml" xmlns:w15="http://schemas.microsoft.com/office/word/2012/wordml" xmlns:w16cex="http://schemas.microsoft.com/office/word/2018/wordml/cex" xmlns:w16cid="http://schemas.microsoft.com/office/word/2016/wordml/cid" xmlns:w16="http://schemas.microsoft.com/office/word/2018/wordml" xmlns:w16du="http://schemas.microsoft.com/office/word/2023/wordml/word16du" xmlns:w16sdtdh="http://schemas.microsoft.com/office/word/2020/wordml/sdtdatahash" xmlns:w16sdtfl="http://schemas.microsoft.com/office/word/2024/wordml/sdtformatlock" xmlns:w16se="http://schemas.microsoft.com/office/word/2015/wordml/symex" xmlns:wpg="http://schemas.microsoft.com/office/word/2010/wordprocessingGroup" xmlns:wpi="http://schemas.microsoft.com/office/word/2010/wordprocessingInk" xmlns:wne="http://schemas.microsoft.com/office/word/2006/wordml" xmlns:wps="http://schemas.microsoft.com/office/word/2010/wordprocessingShape" mc:Ignorable="w14 w15 w16se w16cid w16 w16cex w16sdtdh w16sdtfl w16du wp14">
   <w:body>
     <w:p>
+      <w:pPr>
+        <w:spacing w:line="480" w:lineRule="auto"/>
+        <w:jc w:val="center"/>
+        <w:rPr>
+          <w:rFonts w:ascii="Arial" w:hAnsi="Arial" w:cs="Arial"/>
+          <w:b/>
+          <w:bCs/>
+        </w:rPr>
+      </w:pPr>
       <w:r>
+        <w:rPr>
+          <w:rFonts w:ascii="Arial" w:hAnsi="Arial" w:cs="Arial"/>
+          <w:b/>
+          <w:bCs/>
+        </w:rPr>
+        <w:t>Brownfield + Flowchart(s)</w:t>
+      </w:r>
+    </w:p>
+    <w:p>
+      <w:pPr>
+        <w:spacing w:line="480" w:lineRule="auto"/>
+        <w:jc w:val="center"/>
+        <w:rPr>
+          <w:rFonts w:ascii="Arial" w:hAnsi="Arial" w:cs="Arial"/>
+        </w:rPr>
+      </w:pPr>
+      <w:r>
+        <w:rPr>
+          <w:rFonts w:ascii="Arial" w:hAnsi="Arial" w:cs="Arial"/>
+        </w:rPr>
+        <w:t>Michael Gordon</w:t>
+      </w:r>
+    </w:p>
+    <w:p>
+      <w:pPr>
+        <w:spacing w:line="480" w:lineRule="auto"/>
+        <w:jc w:val="center"/>
+        <w:rPr>
+          <w:rFonts w:ascii="Arial" w:hAnsi="Arial" w:cs="Arial"/>
+        </w:rPr>
+      </w:pPr>
+      <w:r>
+        <w:rPr>
+          <w:rFonts w:ascii="Arial" w:hAnsi="Arial" w:cs="Arial"/>
+        </w:rPr>
+        <w:t>Bellevue University</w:t>
+      </w:r>
+    </w:p>
+    <w:p>
+      <w:pPr>
+        <w:spacing w:line="480" w:lineRule="auto"/>
+        <w:jc w:val="center"/>
+        <w:rPr>
+          <w:rFonts w:ascii="Arial" w:hAnsi="Arial" w:cs="Arial"/>
+        </w:rPr>
+      </w:pPr>
+      <w:r>
+        <w:rPr>
+          <w:rFonts w:ascii="Arial" w:hAnsi="Arial" w:cs="Arial"/>
+        </w:rPr>
+        <w:t>Advanced Python CSD325</w:t>
+      </w:r>
+    </w:p>
+    <w:p>
+      <w:pPr>
+        <w:spacing w:line="480" w:lineRule="auto"/>
+        <w:jc w:val="center"/>
+        <w:rPr>
+          <w:rFonts w:ascii="Arial" w:hAnsi="Arial" w:cs="Arial"/>
+        </w:rPr>
+      </w:pPr>
+      <w:r>
+        <w:rPr>
+          <w:rFonts w:ascii="Arial" w:hAnsi="Arial" w:cs="Arial"/>
+        </w:rPr>
+        <w:t xml:space="preserve">Professor: </w:t>
+      </w:r>
+      <w:r>
+        <w:rPr>
+          <w:rFonts w:ascii="Arial" w:hAnsi="Arial" w:cs="Arial"/>
+        </w:rPr>
+        <w:t>Dr. Toni Farley</w:t>
+      </w:r>
+    </w:p>
+    <w:p>
+      <w:pPr>
+        <w:spacing w:line="480" w:lineRule="auto"/>
+        <w:jc w:val="center"/>
+        <w:rPr>
+          <w:rFonts w:ascii="Arial" w:hAnsi="Arial" w:cs="Arial"/>
+        </w:rPr>
+      </w:pPr>
+      <w:r>
+        <w:rPr>
+          <w:rFonts w:ascii="Arial" w:hAnsi="Arial" w:cs="Arial"/>
+        </w:rPr>
+        <w:t>0</w:t>
+      </w:r>
+      <w:r>
+        <w:rPr>
+          <w:rFonts w:ascii="Arial" w:hAnsi="Arial" w:cs="Arial"/>
+        </w:rPr>
+        <w:t>8</w:t>
+      </w:r>
+      <w:r>
+        <w:rPr>
+          <w:rFonts w:ascii="Arial" w:hAnsi="Arial" w:cs="Arial"/>
+        </w:rPr>
+        <w:t>/</w:t>
+      </w:r>
+      <w:r>
+        <w:rPr>
+          <w:rFonts w:ascii="Arial" w:hAnsi="Arial" w:cs="Arial"/>
+        </w:rPr>
+        <w:t>2</w:t>
+      </w:r>
+      <w:r>
+        <w:rPr>
+          <w:rFonts w:ascii="Arial" w:hAnsi="Arial" w:cs="Arial"/>
+        </w:rPr>
+        <w:t>7</w:t>
+      </w:r>
+      <w:r>
+        <w:rPr>
+          <w:rFonts w:ascii="Arial" w:hAnsi="Arial" w:cs="Arial"/>
+        </w:rPr>
+        <w:t>/2026</w:t>
+      </w:r>
+    </w:p>
+    <w:p/>
+    <w:p>
+      <w:r>
+        <w:rPr>
+          <w:noProof/>
+        </w:rPr>
         <w:drawing>
           <wp:inline distT="0" distB="0" distL="0" distR="0" wp14:anchorId="4CA8832B" wp14:editId="5D0A9EC6">
             <wp:extent cx="5943600" cy="4871085"/>
@@ -451,6 +585,7 @@
   <w:style w:type="paragraph" w:default="1" w:styleId="Normal">
     <w:name w:val="Normal"/>
     <w:qFormat/>
+    <w:rsid w:val="00FD1EA9"/>
   </w:style>
   <w:style w:type="paragraph" w:styleId="Heading1">
     <w:name w:val="heading 1"/>

</xml_diff>